<commit_message>
Cuadro Comparativo con múltiples ítems y Nota que los jala
- El Cuadro Comparativo ahora admite varios ítems: cada ítem es una fila con
  su cantidad y el precio + marca de cada postor (matriz ítem×postor). El
  generador inserta filas manteniendo fórmulas, combinaciones, sombreado del
  ganador, VALOR UNITARIO/ESTIMADO por ítem y la fila TOTAL (suma por postor y
  valor estimado total). Se reubica el pie y su estado de filas ocultas.
- La Nota Informativa jala una fila por ítem del comparativo (descripción y
  monto = precio del ganador x cantidad); la tabla de crédito es un bucle con
  fila TOTAL. Su formulario ahora es de filas repetibles (CCMN/CCP SIAF/
  Descripción/Meta/Específica/F.F./Monto).
- Autoguardado incluye los ítems del comparativo y las filas de la nota.

Co-Authored-By: Claude Opus 4.8 <noreply@anthropic.com>
Claude-Session: https://claude.ai/code/session_01S69ej8Vgbpjdhn84ABgydA
</commit_message>
<xml_diff>
--- a/plantilla/NOTA_INFORMATIVA.docx
+++ b/plantilla/NOTA_INFORMATIVA.docx
@@ -787,7 +787,7 @@
                 <w:sz w:val="20"/>
                 <w:szCs w:val="20"/>
               </w:rPr>
-              <w:t xml:space="preserve">{ccmn}</w:t>
+              <w:t xml:space="preserve">{#filas}{ccmn}</w:t>
             </w:r>
           </w:p>
         </w:tc>
@@ -949,7 +949,7 @@
                 <w:sz w:val="20"/>
                 <w:szCs w:val="20"/>
               </w:rPr>
-              <w:t xml:space="preserve">{monto}</w:t>
+              <w:t xml:space="preserve">{monto}{/filas}</w:t>
             </w:r>
           </w:p>
         </w:tc>
@@ -1006,7 +1006,7 @@
                 <w:sz w:val="20"/>
                 <w:szCs w:val="20"/>
               </w:rPr>
-              <w:t xml:space="preserve">{monto}</w:t>
+              <w:t xml:space="preserve">{montoTotal}</w:t>
             </w:r>
           </w:p>
         </w:tc>

</xml_diff>